<commit_message>
Pošta a Editor 1.2026.1020.1
Co-Authored-By: Claude Sonnet 5.5 <noreply@anthropic.com>
Claude-Session: https://claude.ai/code/session_01TwqswaCHEdGxzojpJdye3M
</commit_message>
<xml_diff>
--- a/prirucky/posta-editor-prirucka.docx
+++ b/prirucky/posta-editor-prirucka.docx
@@ -123,7 +123,7 @@
         </w:numPr>
       </w:pPr>
       <w:r>
-        <w:t xml:space="preserve">Na dotaz, zda vytvořit na Ploše zástupce Pošty a uživatelské příručky, zvolte Ano nebo Ne.</w:t>
+        <w:t xml:space="preserve">Na dotaz, zda vytvořit na Ploše zástupce Pošty, Editoru a uživatelské příručky, zvolte Ano nebo Ne.</w:t>
       </w:r>
     </w:p>
     <w:p>
@@ -334,7 +334,7 @@
       <w:r>
         <w:t xml:space="preserve">Na účtu Google musíte mít zapnuté dvoufázové ověření: </w:t>
       </w:r>
-      <w:hyperlink w:history="1" r:id="rIdpvhj5bea7lp5ahhyqp56h">
+      <w:hyperlink w:history="1" r:id="rIdcdgrzsyziblmgbp9wub52">
         <w:r>
           <w:rPr>
             <w:rStyle w:val="Hyperlink"/>
@@ -357,7 +357,7 @@
       <w:r>
         <w:t xml:space="preserve">Otevřete stránku pro vytvoření hesla aplikace: </w:t>
       </w:r>
-      <w:hyperlink w:history="1" r:id="rIdasotre9f8tryqwqvsjbgx">
+      <w:hyperlink w:history="1" r:id="rIddp4mgazobk4-5l-62fs-9">
         <w:r>
           <w:rPr>
             <w:rStyle w:val="Hyperlink"/>
@@ -400,7 +400,7 @@
       <w:r>
         <w:t xml:space="preserve">Návod Googlu: </w:t>
       </w:r>
-      <w:hyperlink w:history="1" r:id="rIdrecj5g9vscihghlbbkrzf">
+      <w:hyperlink w:history="1" r:id="rIdej45kkwzxn2xmpjeyv7ys">
         <w:r>
           <w:rPr>
             <w:rStyle w:val="Hyperlink"/>

</xml_diff>

<commit_message>
Pošta a Editor 1.2026.1022.1
Co-Authored-By: Claude Sonnet 5.5 <noreply@anthropic.com>
Claude-Session: https://claude.ai/code/session_01TwqswaCHEdGxzojpJdye3M
</commit_message>
<xml_diff>
--- a/prirucky/posta-editor-prirucka.docx
+++ b/prirucky/posta-editor-prirucka.docx
@@ -334,7 +334,7 @@
       <w:r>
         <w:t xml:space="preserve">Na účtu Google musíte mít zapnuté dvoufázové ověření: </w:t>
       </w:r>
-      <w:hyperlink w:history="1" r:id="rIdcdgrzsyziblmgbp9wub52">
+      <w:hyperlink w:history="1" r:id="rIdt8_ccervybhz4wkqso8zp">
         <w:r>
           <w:rPr>
             <w:rStyle w:val="Hyperlink"/>
@@ -357,7 +357,7 @@
       <w:r>
         <w:t xml:space="preserve">Otevřete stránku pro vytvoření hesla aplikace: </w:t>
       </w:r>
-      <w:hyperlink w:history="1" r:id="rIddp4mgazobk4-5l-62fs-9">
+      <w:hyperlink w:history="1" r:id="rIdtvdiipldkys8xedecfyc-">
         <w:r>
           <w:rPr>
             <w:rStyle w:val="Hyperlink"/>
@@ -400,7 +400,7 @@
       <w:r>
         <w:t xml:space="preserve">Návod Googlu: </w:t>
       </w:r>
-      <w:hyperlink w:history="1" r:id="rIdej45kkwzxn2xmpjeyv7ys">
+      <w:hyperlink w:history="1" r:id="rIdeluipmcipjq_nwfyv4268">
         <w:r>
           <w:rPr>
             <w:rStyle w:val="Hyperlink"/>
@@ -854,7 +854,7 @@
         <w:t xml:space="preserve">Ctrl+R</w:t>
       </w:r>
       <w:r>
-        <w:t xml:space="preserve"> – odpovědět</w:t>
+        <w:t xml:space="preserve"> – odpovědět; u zprávy z e-mailové konference se odpověď vyplní na adresu konference, stejně jako v jiných poštovních programech</w:t>
       </w:r>
     </w:p>
     <w:p>
@@ -2229,10 +2229,6 @@
 </w:document>
 </file>
 
-<file path=word/comments.xml><?xml version="1.0" encoding="utf-8"?>
-<w:comments xmlns:cx="http://schemas.microsoft.com/office/drawing/2014/chartex" xmlns:cx1="http://schemas.microsoft.com/office/drawing/2015/9/8/chartex" xmlns:cx2="http://schemas.microsoft.com/office/drawing/2015/10/21/chartex" xmlns:cx3="http://schemas.microsoft.com/office/drawing/2016/5/9/chartex" xmlns:cx4="http://schemas.microsoft.com/office/drawing/2016/5/10/chartex" xmlns:cx5="http://schemas.microsoft.com/office/drawing/2016/5/11/chartex" xmlns:cx6="http://schemas.microsoft.com/office/drawing/2016/5/12/chartex" xmlns:cx7="http://schemas.microsoft.com/office/drawing/2016/5/13/chartex" xmlns:cx8="http://schemas.microsoft.com/office/drawing/2016/5/14/chartex" xmlns:mc="http://schemas.openxmlformats.org/markup-compatibility/2006" xmlns:aink="http://schemas.microsoft.com/office/drawing/2016/ink" xmlns:am3d="http://schemas.microsoft.com/office/drawing/2017/model3d" xmlns:o="urn:schemas-microsoft-com:office:office" xmlns:r="http://schemas.openxmlformats.org/officeDocument/2006/relationships" xmlns:m="http://schemas.openxmlformats.org/officeDocument/2006/math" xmlns:v="urn:schemas-microsoft-com:vml" xmlns:wp14="http://schemas.microsoft.com/office/word/2010/wordprocessingDrawing" xmlns:wp="http://schemas.openxmlformats.org/drawingml/2006/wordprocessingDrawing" xmlns:w10="urn:schemas-microsoft-com:office:word" xmlns:w="http://schemas.openxmlformats.org/wordprocessingml/2006/main" xmlns:w14="http://schemas.microsoft.com/office/word/2010/wordml" xmlns:w15="http://schemas.microsoft.com/office/word/2012/wordml" xmlns:w16cex="http://schemas.microsoft.com/office/word/2018/wordml/cex" xmlns:w16cid="http://schemas.microsoft.com/office/word/2016/wordml/cid" xmlns:w16="http://schemas.microsoft.com/office/word/2018/wordml" xmlns:w16sdtdh="http://schemas.microsoft.com/office/word/2020/wordml/sdtdatahash" xmlns:w16se="http://schemas.microsoft.com/office/word/2015/wordml/symex" xmlns:wpg="http://schemas.microsoft.com/office/word/2010/wordprocessingGroup" xmlns:wpi="http://schemas.microsoft.com/office/word/2010/wordprocessingInk" xmlns:wne="http://schemas.microsoft.com/office/word/2006/wordml" xmlns:wps="http://schemas.microsoft.com/office/word/2010/wordprocessingShape"/>
-</file>
-
 <file path=word/endnotes.xml><?xml version="1.0" encoding="utf-8"?>
 <w:endnotes xmlns:wpc="http://schemas.microsoft.com/office/word/2010/wordprocessingCanvas" xmlns:mc="http://schemas.openxmlformats.org/markup-compatibility/2006" xmlns:o="urn:schemas-microsoft-com:office:office" xmlns:r="http://schemas.openxmlformats.org/officeDocument/2006/relationships" xmlns:m="http://schemas.openxmlformats.org/officeDocument/2006/math" xmlns:v="urn:schemas-microsoft-com:vml" xmlns:wp14="http://schemas.microsoft.com/office/word/2010/wordprocessingDrawing" xmlns:wp="http://schemas.openxmlformats.org/drawingml/2006/wordprocessingDrawing" xmlns:w10="urn:schemas-microsoft-com:office:word" xmlns:w="http://schemas.openxmlformats.org/wordprocessingml/2006/main" xmlns:w14="http://schemas.microsoft.com/office/word/2010/wordml" xmlns:w15="http://schemas.microsoft.com/office/word/2012/wordml" xmlns:wpg="http://schemas.microsoft.com/office/word/2010/wordprocessingGroup" xmlns:wpi="http://schemas.microsoft.com/office/word/2010/wordprocessingInk" xmlns:wne="http://schemas.microsoft.com/office/word/2006/wordml" xmlns:wps="http://schemas.microsoft.com/office/word/2010/wordprocessingShape" mc:Ignorable="w14 w15 wp14">
   <w:endnote w:type="separator" w:id="-1">
@@ -2311,7 +2307,7 @@
 <w:numbering xmlns:wpc="http://schemas.microsoft.com/office/word/2010/wordprocessingCanvas" xmlns:mc="http://schemas.openxmlformats.org/markup-compatibility/2006" xmlns:o="urn:schemas-microsoft-com:office:office" xmlns:r="http://schemas.openxmlformats.org/officeDocument/2006/relationships" xmlns:m="http://schemas.openxmlformats.org/officeDocument/2006/math" xmlns:v="urn:schemas-microsoft-com:vml" xmlns:wp14="http://schemas.microsoft.com/office/word/2010/wordprocessingDrawing" xmlns:wp="http://schemas.openxmlformats.org/drawingml/2006/wordprocessingDrawing" xmlns:w10="urn:schemas-microsoft-com:office:word" xmlns:w="http://schemas.openxmlformats.org/wordprocessingml/2006/main" xmlns:w14="http://schemas.microsoft.com/office/word/2010/wordml" xmlns:w15="http://schemas.microsoft.com/office/word/2012/wordml" xmlns:wpg="http://schemas.microsoft.com/office/word/2010/wordprocessingGroup" xmlns:wpi="http://schemas.microsoft.com/office/word/2010/wordprocessingInk" xmlns:wne="http://schemas.microsoft.com/office/word/2006/wordml" xmlns:wps="http://schemas.microsoft.com/office/word/2010/wordprocessingShape" mc:Ignorable="w14 w15 wp14">
   <w:abstractNum w:abstractNumId="1" w15:restartNumberingAfterBreak="0">
     <w:multiLevelType w:val="hybridMultilevel"/>
-    <w:lvl w:ilvl="0" w15:tentative="1">
+    <w:lvl w:ilvl="0" w:tentative="1">
       <w:start w:val="1"/>
       <w:numFmt w:val="bullet"/>
       <w:lvlText w:val="●"/>
@@ -2320,7 +2316,7 @@
         <w:ind w:left="720" w:hanging="360"/>
       </w:pPr>
     </w:lvl>
-    <w:lvl w:ilvl="1" w15:tentative="1">
+    <w:lvl w:ilvl="1" w:tentative="1">
       <w:start w:val="1"/>
       <w:numFmt w:val="bullet"/>
       <w:lvlText w:val="○"/>
@@ -2329,7 +2325,7 @@
         <w:ind w:left="1440" w:hanging="360"/>
       </w:pPr>
     </w:lvl>
-    <w:lvl w:ilvl="2" w15:tentative="1">
+    <w:lvl w:ilvl="2" w:tentative="1">
       <w:start w:val="1"/>
       <w:numFmt w:val="bullet"/>
       <w:lvlText w:val="■"/>
@@ -2338,7 +2334,7 @@
         <w:ind w:left="2160" w:hanging="360"/>
       </w:pPr>
     </w:lvl>
-    <w:lvl w:ilvl="3" w15:tentative="1">
+    <w:lvl w:ilvl="3" w:tentative="1">
       <w:start w:val="1"/>
       <w:numFmt w:val="bullet"/>
       <w:lvlText w:val="●"/>
@@ -2347,7 +2343,7 @@
         <w:ind w:left="2880" w:hanging="360"/>
       </w:pPr>
     </w:lvl>
-    <w:lvl w:ilvl="4" w15:tentative="1">
+    <w:lvl w:ilvl="4" w:tentative="1">
       <w:start w:val="1"/>
       <w:numFmt w:val="bullet"/>
       <w:lvlText w:val="○"/>
@@ -2356,7 +2352,7 @@
         <w:ind w:left="3600" w:hanging="360"/>
       </w:pPr>
     </w:lvl>
-    <w:lvl w:ilvl="5" w15:tentative="1">
+    <w:lvl w:ilvl="5" w:tentative="1">
       <w:start w:val="1"/>
       <w:numFmt w:val="bullet"/>
       <w:lvlText w:val="■"/>
@@ -2365,7 +2361,7 @@
         <w:ind w:left="4320" w:hanging="360"/>
       </w:pPr>
     </w:lvl>
-    <w:lvl w:ilvl="6" w15:tentative="1">
+    <w:lvl w:ilvl="6" w:tentative="1">
       <w:start w:val="1"/>
       <w:numFmt w:val="bullet"/>
       <w:lvlText w:val="●"/>
@@ -2374,7 +2370,7 @@
         <w:ind w:left="5040" w:hanging="360"/>
       </w:pPr>
     </w:lvl>
-    <w:lvl w:ilvl="7" w15:tentative="1">
+    <w:lvl w:ilvl="7" w:tentative="1">
       <w:start w:val="1"/>
       <w:numFmt w:val="bullet"/>
       <w:lvlText w:val="●"/>
@@ -2383,7 +2379,7 @@
         <w:ind w:left="5760" w:hanging="360"/>
       </w:pPr>
     </w:lvl>
-    <w:lvl w:ilvl="8" w15:tentative="1">
+    <w:lvl w:ilvl="8" w:tentative="1">
       <w:start w:val="1"/>
       <w:numFmt w:val="bullet"/>
       <w:lvlText w:val="●"/>
@@ -2395,7 +2391,7 @@
   </w:abstractNum>
   <w:abstractNum w:abstractNumId="2" w15:restartNumberingAfterBreak="0">
     <w:multiLevelType w:val="hybridMultilevel"/>
-    <w:lvl w:ilvl="0" w15:tentative="1">
+    <w:lvl w:ilvl="0" w:tentative="1">
       <w:start w:val="1"/>
       <w:numFmt w:val="bullet"/>
       <w:lvlText w:val="•"/>
@@ -2407,7 +2403,7 @@
   </w:abstractNum>
   <w:abstractNum w:abstractNumId="3" w15:restartNumberingAfterBreak="0">
     <w:multiLevelType w:val="hybridMultilevel"/>
-    <w:lvl w:ilvl="0" w15:tentative="1">
+    <w:lvl w:ilvl="0" w:tentative="1">
       <w:start w:val="1"/>
       <w:numFmt w:val="decimal"/>
       <w:lvlText w:val="%1."/>
@@ -2419,7 +2415,7 @@
   </w:abstractNum>
   <w:abstractNum w:abstractNumId="4" w15:restartNumberingAfterBreak="0">
     <w:multiLevelType w:val="hybridMultilevel"/>
-    <w:lvl w:ilvl="0" w15:tentative="1">
+    <w:lvl w:ilvl="0" w:tentative="1">
       <w:start w:val="1"/>
       <w:numFmt w:val="decimal"/>
       <w:lvlText w:val="%1."/>
@@ -2431,7 +2427,7 @@
   </w:abstractNum>
   <w:abstractNum w:abstractNumId="5" w15:restartNumberingAfterBreak="0">
     <w:multiLevelType w:val="hybridMultilevel"/>
-    <w:lvl w:ilvl="0" w15:tentative="1">
+    <w:lvl w:ilvl="0" w:tentative="1">
       <w:start w:val="1"/>
       <w:numFmt w:val="decimal"/>
       <w:lvlText w:val="%1."/>
@@ -2443,7 +2439,7 @@
   </w:abstractNum>
   <w:abstractNum w:abstractNumId="6" w15:restartNumberingAfterBreak="0">
     <w:multiLevelType w:val="hybridMultilevel"/>
-    <w:lvl w:ilvl="0" w15:tentative="1">
+    <w:lvl w:ilvl="0" w:tentative="1">
       <w:start w:val="1"/>
       <w:numFmt w:val="decimal"/>
       <w:lvlText w:val="%1."/>
@@ -2455,7 +2451,7 @@
   </w:abstractNum>
   <w:abstractNum w:abstractNumId="7" w15:restartNumberingAfterBreak="0">
     <w:multiLevelType w:val="hybridMultilevel"/>
-    <w:lvl w:ilvl="0" w15:tentative="1">
+    <w:lvl w:ilvl="0" w:tentative="1">
       <w:start w:val="1"/>
       <w:numFmt w:val="decimal"/>
       <w:lvlText w:val="%1."/>
@@ -2467,7 +2463,7 @@
   </w:abstractNum>
   <w:abstractNum w:abstractNumId="8" w15:restartNumberingAfterBreak="0">
     <w:multiLevelType w:val="hybridMultilevel"/>
-    <w:lvl w:ilvl="0" w15:tentative="1">
+    <w:lvl w:ilvl="0" w:tentative="1">
       <w:start w:val="1"/>
       <w:numFmt w:val="decimal"/>
       <w:lvlText w:val="%1."/>
@@ -2540,37 +2536,9 @@
     </w:rPrDefault>
     <w:pPrDefault/>
   </w:docDefaults>
-  <w:style w:type="paragraph" w:styleId="Title">
-    <w:name w:val="Title"/>
-    <w:basedOn w:val="Normal"/>
-    <w:next w:val="Normal"/>
+  <w:style w:type="paragraph" w:styleId="Normal" w:default="1">
+    <w:name w:val="Normal"/>
     <w:qFormat/>
-    <w:rPr>
-      <w:sz w:val="56"/>
-      <w:szCs w:val="56"/>
-    </w:rPr>
-  </w:style>
-  <w:style w:type="paragraph" w:styleId="Heading1">
-    <w:name w:val="Heading 1"/>
-    <w:basedOn w:val="Normal"/>
-    <w:next w:val="Normal"/>
-    <w:qFormat/>
-    <w:rPr>
-      <w:color w:val="2E74B5"/>
-      <w:sz w:val="32"/>
-      <w:szCs w:val="32"/>
-    </w:rPr>
-  </w:style>
-  <w:style w:type="paragraph" w:styleId="Heading2">
-    <w:name w:val="Heading 2"/>
-    <w:basedOn w:val="Normal"/>
-    <w:next w:val="Normal"/>
-    <w:qFormat/>
-    <w:rPr>
-      <w:color w:val="2E74B5"/>
-      <w:sz w:val="26"/>
-      <w:szCs w:val="26"/>
-    </w:rPr>
   </w:style>
   <w:style w:type="paragraph" w:styleId="Heading3">
     <w:name w:val="Heading 3"/>
@@ -2761,4 +2729,294 @@
     </w:rPr>
   </w:style>
 </w:styles>
+</file>
+
+<file path=word/theme/theme1.xml><?xml version="1.0" encoding="utf-8"?>
+<a:theme xmlns:a="http://schemas.openxmlformats.org/drawingml/2006/main" name="Office Theme">
+  <a:themeElements>
+    <a:clrScheme name="Office">
+      <a:dk1>
+        <a:sysClr val="windowText" lastClr="000000"/>
+      </a:dk1>
+      <a:lt1>
+        <a:sysClr val="window" lastClr="FFFFFF"/>
+      </a:lt1>
+      <a:dk2>
+        <a:srgbClr val="44546A"/>
+      </a:dk2>
+      <a:lt2>
+        <a:srgbClr val="E7E6E6"/>
+      </a:lt2>
+      <a:accent1>
+        <a:srgbClr val="4472C4"/>
+      </a:accent1>
+      <a:accent2>
+        <a:srgbClr val="ED7D31"/>
+      </a:accent2>
+      <a:accent3>
+        <a:srgbClr val="A5A5A5"/>
+      </a:accent3>
+      <a:accent4>
+        <a:srgbClr val="FFC000"/>
+      </a:accent4>
+      <a:accent5>
+        <a:srgbClr val="5B9BD5"/>
+      </a:accent5>
+      <a:accent6>
+        <a:srgbClr val="70AD47"/>
+      </a:accent6>
+      <a:hlink>
+        <a:srgbClr val="0563C1"/>
+      </a:hlink>
+      <a:folHlink>
+        <a:srgbClr val="954F72"/>
+      </a:folHlink>
+    </a:clrScheme>
+    <a:fontScheme name="Office">
+      <a:majorFont>
+        <a:latin typeface="Calibri Light" panose="020F0302020204030204"/>
+        <a:ea typeface=""/>
+        <a:cs typeface=""/>
+        <a:font script="Jpan" typeface="游ゴシック Light"/>
+        <a:font script="Hang" typeface="맑은 고딕"/>
+        <a:font script="Hans" typeface="等线 Light"/>
+        <a:font script="Hant" typeface="新細明體"/>
+        <a:font script="Arab" typeface="Times New Roman"/>
+        <a:font script="Hebr" typeface="Times New Roman"/>
+        <a:font script="Thai" typeface="Angsana New"/>
+        <a:font script="Ethi" typeface="Nyala"/>
+        <a:font script="Beng" typeface="Vrinda"/>
+        <a:font script="Gujr" typeface="Shruti"/>
+        <a:font script="Khmr" typeface="MoolBoran"/>
+        <a:font script="Knda" typeface="Tunga"/>
+        <a:font script="Guru" typeface="Raavi"/>
+        <a:font script="Cans" typeface="Euphemia"/>
+        <a:font script="Cher" typeface="Plantagenet Cherokee"/>
+        <a:font script="Yiii" typeface="Microsoft Yi Baiti"/>
+        <a:font script="Tibt" typeface="Microsoft Himalaya"/>
+        <a:font script="Thaa" typeface="MV Boli"/>
+        <a:font script="Deva" typeface="Mangal"/>
+        <a:font script="Telu" typeface="Gautami"/>
+        <a:font script="Taml" typeface="Latha"/>
+        <a:font script="Syrc" typeface="Estrangelo Edessa"/>
+        <a:font script="Orya" typeface="Kalinga"/>
+        <a:font script="Mlym" typeface="Kartika"/>
+        <a:font script="Laoo" typeface="DokChampa"/>
+        <a:font script="Sinh" typeface="Iskoola Pota"/>
+        <a:font script="Mong" typeface="Mongolian Baiti"/>
+        <a:font script="Viet" typeface="Times New Roman"/>
+        <a:font script="Uigh" typeface="Microsoft Uighur"/>
+        <a:font script="Geor" typeface="Sylfaen"/>
+        <a:font script="Armn" typeface="Arial"/>
+        <a:font script="Bugi" typeface="Leelawadee UI"/>
+        <a:font script="Bopo" typeface="Microsoft JhengHei"/>
+        <a:font script="Java" typeface="Javanese Text"/>
+        <a:font script="Lisu" typeface="Segoe UI"/>
+        <a:font script="Mymr" typeface="Myanmar Text"/>
+        <a:font script="Nkoo" typeface="Ebrima"/>
+        <a:font script="Olck" typeface="Nirmala UI"/>
+        <a:font script="Osma" typeface="Ebrima"/>
+        <a:font script="Phag" typeface="Phagspa"/>
+        <a:font script="Syrn" typeface="Estrangelo Edessa"/>
+        <a:font script="Syrj" typeface="Estrangelo Edessa"/>
+        <a:font script="Syre" typeface="Estrangelo Edessa"/>
+        <a:font script="Sora" typeface="Nirmala UI"/>
+        <a:font script="Tale" typeface="Microsoft Tai Le"/>
+        <a:font script="Talu" typeface="Microsoft New Tai Lue"/>
+        <a:font script="Tfng" typeface="Ebrima"/>
+      </a:majorFont>
+      <a:minorFont>
+        <a:latin typeface="Calibri" panose="020F0502020204030204"/>
+        <a:ea typeface=""/>
+        <a:cs typeface=""/>
+        <a:font script="Jpan" typeface="游明朝"/>
+        <a:font script="Hang" typeface="맑은 고딕"/>
+        <a:font script="Hans" typeface="等线"/>
+        <a:font script="Hant" typeface="新細明體"/>
+        <a:font script="Arab" typeface="Arial"/>
+        <a:font script="Hebr" typeface="Arial"/>
+        <a:font script="Thai" typeface="Cordia New"/>
+        <a:font script="Ethi" typeface="Nyala"/>
+        <a:font script="Beng" typeface="Vrinda"/>
+        <a:font script="Gujr" typeface="Shruti"/>
+        <a:font script="Khmr" typeface="DaunPenh"/>
+        <a:font script="Knda" typeface="Tunga"/>
+        <a:font script="Guru" typeface="Raavi"/>
+        <a:font script="Cans" typeface="Euphemia"/>
+        <a:font script="Cher" typeface="Plantagenet Cherokee"/>
+        <a:font script="Yiii" typeface="Microsoft Yi Baiti"/>
+        <a:font script="Tibt" typeface="Microsoft Himalaya"/>
+        <a:font script="Thaa" typeface="MV Boli"/>
+        <a:font script="Deva" typeface="Mangal"/>
+        <a:font script="Telu" typeface="Gautami"/>
+        <a:font script="Taml" typeface="Latha"/>
+        <a:font script="Syrc" typeface="Estrangelo Edessa"/>
+        <a:font script="Orya" typeface="Kalinga"/>
+        <a:font script="Mlym" typeface="Kartika"/>
+        <a:font script="Laoo" typeface="DokChampa"/>
+        <a:font script="Sinh" typeface="Iskoola Pota"/>
+        <a:font script="Mong" typeface="Mongolian Baiti"/>
+        <a:font script="Viet" typeface="Arial"/>
+        <a:font script="Uigh" typeface="Microsoft Uighur"/>
+        <a:font script="Geor" typeface="Sylfaen"/>
+        <a:font script="Armn" typeface="Arial"/>
+        <a:font script="Bugi" typeface="Leelawadee UI"/>
+        <a:font script="Bopo" typeface="Microsoft JhengHei"/>
+        <a:font script="Java" typeface="Javanese Text"/>
+        <a:font script="Lisu" typeface="Segoe UI"/>
+        <a:font script="Mymr" typeface="Myanmar Text"/>
+        <a:font script="Nkoo" typeface="Ebrima"/>
+        <a:font script="Olck" typeface="Nirmala UI"/>
+        <a:font script="Osma" typeface="Ebrima"/>
+        <a:font script="Phag" typeface="Phagspa"/>
+        <a:font script="Syrn" typeface="Estrangelo Edessa"/>
+        <a:font script="Syrj" typeface="Estrangelo Edessa"/>
+        <a:font script="Syre" typeface="Estrangelo Edessa"/>
+        <a:font script="Sora" typeface="Nirmala UI"/>
+        <a:font script="Tale" typeface="Microsoft Tai Le"/>
+        <a:font script="Talu" typeface="Microsoft New Tai Lue"/>
+        <a:font script="Tfng" typeface="Ebrima"/>
+      </a:minorFont>
+    </a:fontScheme>
+    <a:fmtScheme name="Office">
+      <a:fillStyleLst>
+        <a:solidFill>
+          <a:schemeClr val="phClr"/>
+        </a:solidFill>
+        <a:gradFill rotWithShape="true">
+          <a:gsLst>
+            <a:gs pos="0">
+              <a:schemeClr val="phClr">
+                <a:lumMod val="110000"/>
+                <a:satMod val="105000"/>
+                <a:tint val="67000"/>
+              </a:schemeClr>
+            </a:gs>
+            <a:gs pos="50000">
+              <a:schemeClr val="phClr">
+                <a:lumMod val="105000"/>
+                <a:satMod val="103000"/>
+                <a:tint val="73000"/>
+              </a:schemeClr>
+            </a:gs>
+            <a:gs pos="100000">
+              <a:schemeClr val="phClr">
+                <a:lumMod val="105000"/>
+                <a:satMod val="109000"/>
+                <a:tint val="81000"/>
+              </a:schemeClr>
+            </a:gs>
+          </a:gsLst>
+          <a:lin ang="5400000" scaled="false"/>
+        </a:gradFill>
+        <a:gradFill rotWithShape="true">
+          <a:gsLst>
+            <a:gs pos="0">
+              <a:schemeClr val="phClr">
+                <a:satMod val="103000"/>
+                <a:lumMod val="102000"/>
+                <a:tint val="94000"/>
+              </a:schemeClr>
+            </a:gs>
+            <a:gs pos="50000">
+              <a:schemeClr val="phClr">
+                <a:satMod val="110000"/>
+                <a:lumMod val="100000"/>
+                <a:shade val="100000"/>
+              </a:schemeClr>
+            </a:gs>
+            <a:gs pos="100000">
+              <a:schemeClr val="phClr">
+                <a:lumMod val="99000"/>
+                <a:satMod val="120000"/>
+                <a:shade val="78000"/>
+              </a:schemeClr>
+            </a:gs>
+          </a:gsLst>
+          <a:lin ang="5400000" scaled="false"/>
+        </a:gradFill>
+      </a:fillStyleLst>
+      <a:lnStyleLst>
+        <a:ln w="6350" cap="flat" cmpd="sng" algn="ctr">
+          <a:solidFill>
+            <a:schemeClr val="phClr"/>
+          </a:solidFill>
+          <a:prstDash val="solid"/>
+          <a:miter lim="800000"/>
+        </a:ln>
+        <a:ln w="12700" cap="flat" cmpd="sng" algn="ctr">
+          <a:solidFill>
+            <a:schemeClr val="phClr"/>
+          </a:solidFill>
+          <a:prstDash val="solid"/>
+          <a:miter lim="800000"/>
+        </a:ln>
+        <a:ln w="19050" cap="flat" cmpd="sng" algn="ctr">
+          <a:solidFill>
+            <a:schemeClr val="phClr"/>
+          </a:solidFill>
+          <a:prstDash val="solid"/>
+          <a:miter lim="800000"/>
+        </a:ln>
+      </a:lnStyleLst>
+      <a:effectStyleLst>
+        <a:effectStyle>
+          <a:effectLst/>
+        </a:effectStyle>
+        <a:effectStyle>
+          <a:effectLst/>
+        </a:effectStyle>
+        <a:effectStyle>
+          <a:effectLst>
+            <a:outerShdw blurRad="57150" dist="19050" dir="5400000" algn="ctr" rotWithShape="false">
+              <a:srgbClr val="000000">
+                <a:alpha val="63000"/>
+              </a:srgbClr>
+            </a:outerShdw>
+          </a:effectLst>
+        </a:effectStyle>
+      </a:effectStyleLst>
+      <a:bgFillStyleLst>
+        <a:solidFill>
+          <a:schemeClr val="phClr"/>
+        </a:solidFill>
+        <a:solidFill>
+          <a:schemeClr val="phClr">
+            <a:tint val="95000"/>
+            <a:satMod val="170000"/>
+          </a:schemeClr>
+        </a:solidFill>
+        <a:gradFill rotWithShape="true">
+          <a:gsLst>
+            <a:gs pos="0">
+              <a:schemeClr val="phClr">
+                <a:tint val="93000"/>
+                <a:satMod val="150000"/>
+                <a:shade val="98000"/>
+                <a:lumMod val="102000"/>
+              </a:schemeClr>
+            </a:gs>
+            <a:gs pos="50000">
+              <a:schemeClr val="phClr">
+                <a:tint val="98000"/>
+                <a:satMod val="130000"/>
+                <a:shade val="90000"/>
+                <a:lumMod val="103000"/>
+              </a:schemeClr>
+            </a:gs>
+            <a:gs pos="100000">
+              <a:schemeClr val="phClr">
+                <a:shade val="63000"/>
+                <a:satMod val="120000"/>
+              </a:schemeClr>
+            </a:gs>
+          </a:gsLst>
+          <a:lin ang="5400000" scaled="false"/>
+        </a:gradFill>
+      </a:bgFillStyleLst>
+    </a:fmtScheme>
+  </a:themeElements>
+  <a:objectDefaults/>
+  <a:extraClrSchemeLst/>
+</a:theme>
 </file>
</xml_diff>

<commit_message>
Pošta a Editor 1.2026.1028.2 (podepsané soubory)
Co-Authored-By: Claude Sonnet 5.5 <noreply@anthropic.com>
Claude-Session: https://claude.ai/code/session_01TwqswaCHEdGxzojpJdye3M
</commit_message>
<xml_diff>
--- a/prirucky/posta-editor-prirucka.docx
+++ b/prirucky/posta-editor-prirucka.docx
@@ -334,7 +334,7 @@
       <w:r>
         <w:t xml:space="preserve">Na účtu Google musíte mít zapnuté dvoufázové ověření: </w:t>
       </w:r>
-      <w:hyperlink w:history="1" r:id="rIdt8_ccervybhz4wkqso8zp">
+      <w:hyperlink w:history="1" r:id="rIdphdohgzqv6bdeb4t23022">
         <w:r>
           <w:rPr>
             <w:rStyle w:val="Hyperlink"/>
@@ -357,7 +357,7 @@
       <w:r>
         <w:t xml:space="preserve">Otevřete stránku pro vytvoření hesla aplikace: </w:t>
       </w:r>
-      <w:hyperlink w:history="1" r:id="rIdtvdiipldkys8xedecfyc-">
+      <w:hyperlink w:history="1" r:id="rIdls3ijeks50nftoup1svym">
         <w:r>
           <w:rPr>
             <w:rStyle w:val="Hyperlink"/>
@@ -400,7 +400,7 @@
       <w:r>
         <w:t xml:space="preserve">Návod Googlu: </w:t>
       </w:r>
-      <w:hyperlink w:history="1" r:id="rIdeluipmcipjq_nwfyv4268">
+      <w:hyperlink w:history="1" r:id="rIduxiuu6jjxgxe309temehs">
         <w:r>
           <w:rPr>
             <w:rStyle w:val="Hyperlink"/>
@@ -719,6 +719,25 @@
           <w:b/>
           <w:bCs/>
         </w:rPr>
+        <w:t xml:space="preserve">Backspace</w:t>
+      </w:r>
+      <w:r>
+        <w:t xml:space="preserve"> – přesune zprávu do Archivu (u Gmailu ji odebere z Doručené pošty, zůstane ve Všech zprávách); když účet Archiv nemá, složka Archiv se založí</w:t>
+      </w:r>
+    </w:p>
+    <w:p>
+      <w:pPr>
+        <w:pStyle w:val="ListParagraph"/>
+        <w:numPr>
+          <w:ilvl w:val="0"/>
+          <w:numId w:val="2"/>
+        </w:numPr>
+      </w:pPr>
+      <w:r>
+        <w:rPr>
+          <w:b/>
+          <w:bCs/>
+        </w:rPr>
         <w:t xml:space="preserve">Ctrl+N</w:t>
       </w:r>
       <w:r>
@@ -893,6 +912,63 @@
       </w:r>
       <w:r>
         <w:t xml:space="preserve"> – zavře zprávu</w:t>
+      </w:r>
+    </w:p>
+    <w:p>
+      <w:pPr>
+        <w:pStyle w:val="ListParagraph"/>
+        <w:numPr>
+          <w:ilvl w:val="0"/>
+          <w:numId w:val="2"/>
+        </w:numPr>
+      </w:pPr>
+      <w:r>
+        <w:rPr>
+          <w:b/>
+          <w:bCs/>
+        </w:rPr>
+        <w:t xml:space="preserve">Backspace</w:t>
+      </w:r>
+      <w:r>
+        <w:t xml:space="preserve"> – zavře zprávu a přesune ji do Archivu</w:t>
+      </w:r>
+    </w:p>
+    <w:p>
+      <w:pPr>
+        <w:pStyle w:val="ListParagraph"/>
+        <w:numPr>
+          <w:ilvl w:val="0"/>
+          <w:numId w:val="2"/>
+        </w:numPr>
+      </w:pPr>
+      <w:r>
+        <w:rPr>
+          <w:b/>
+          <w:bCs/>
+        </w:rPr>
+        <w:t xml:space="preserve">Alt+šipka vpravo</w:t>
+      </w:r>
+      <w:r>
+        <w:t xml:space="preserve"> – otevře následující zprávu ze seznamu a hned ji začne číst od začátku</w:t>
+      </w:r>
+    </w:p>
+    <w:p>
+      <w:pPr>
+        <w:pStyle w:val="ListParagraph"/>
+        <w:numPr>
+          <w:ilvl w:val="0"/>
+          <w:numId w:val="2"/>
+        </w:numPr>
+      </w:pPr>
+      <w:r>
+        <w:rPr>
+          <w:b/>
+          <w:bCs/>
+        </w:rPr>
+        <w:t xml:space="preserve">Alt+šipka vlevo</w:t>
+      </w:r>
+      <w:r>
+        <w:t xml:space="preserve"> – otevře předchozí zprávu ze seznamu a hned ji začne číst od začátku</w:t>
       </w:r>
     </w:p>
     <w:p>

</xml_diff>

<commit_message>
Pošta a Editor 1.2026.1029.2
Co-Authored-By: Claude Sonnet 5.5 <noreply@anthropic.com>
Claude-Session: https://claude.ai/code/session_01TwqswaCHEdGxzojpJdye3M
</commit_message>
<xml_diff>
--- a/prirucky/posta-editor-prirucka.docx
+++ b/prirucky/posta-editor-prirucka.docx
@@ -195,6 +195,70 @@
         <w:pStyle w:val="Heading2"/>
       </w:pPr>
       <w:r>
+        <w:t xml:space="preserve">Skript pro JAWS a doplněk pro NVDA</w:t>
+      </w:r>
+    </w:p>
+    <w:p>
+      <w:pPr>
+        <w:spacing w:after="120"/>
+      </w:pPr>
+      <w:r>
+        <w:t xml:space="preserve">Instalátor sám přidá úpravy pro odečítače obrazovky, které má počítač nainstalované. Díky nim se po otevření zprávy rovnou čte její text, bez úvodního hlášení okna a editačního pole, a v seznamu zpráv se nic neopakuje dvakrát.</w:t>
+      </w:r>
+    </w:p>
+    <w:p>
+      <w:pPr>
+        <w:pStyle w:val="ListParagraph"/>
+        <w:numPr>
+          <w:ilvl w:val="0"/>
+          <w:numId w:val="2"/>
+        </w:numPr>
+      </w:pPr>
+      <w:r>
+        <w:t xml:space="preserve">JAWS: skript pro Poštu se přidá do všech nainstalovaných verzí JAWS a sám se zkompiluje. Po instalaci restartujte JAWS.</w:t>
+      </w:r>
+    </w:p>
+    <w:p>
+      <w:pPr>
+        <w:pStyle w:val="ListParagraph"/>
+        <w:numPr>
+          <w:ilvl w:val="0"/>
+          <w:numId w:val="2"/>
+        </w:numPr>
+      </w:pPr>
+      <w:r>
+        <w:t xml:space="preserve">NVDA: doplněk Pošta – tiché otevírání zpráv se nainstaluje sám. Pokud NVDA běží, instalátor nabídne jeho restart, aby se doplněk načetl.</w:t>
+      </w:r>
+    </w:p>
+    <w:p>
+      <w:pPr>
+        <w:pStyle w:val="ListParagraph"/>
+        <w:numPr>
+          <w:ilvl w:val="0"/>
+          <w:numId w:val="2"/>
+        </w:numPr>
+      </w:pPr>
+      <w:r>
+        <w:t xml:space="preserve">Když se v okně zprávy přesunete Tabulátorem do textu zprávy, kurzor skočí na začátek e-mailu.</w:t>
+      </w:r>
+    </w:p>
+    <w:p>
+      <w:pPr>
+        <w:pStyle w:val="ListParagraph"/>
+        <w:numPr>
+          <w:ilvl w:val="0"/>
+          <w:numId w:val="2"/>
+        </w:numPr>
+      </w:pPr>
+      <w:r>
+        <w:t xml:space="preserve">Při odinstalaci se skript i doplněk zase odeberou.</w:t>
+      </w:r>
+    </w:p>
+    <w:p>
+      <w:pPr>
+        <w:pStyle w:val="Heading2"/>
+      </w:pPr>
+      <w:r>
         <w:t xml:space="preserve">Když soubor nejde otevřít</w:t>
       </w:r>
     </w:p>
@@ -334,7 +398,7 @@
       <w:r>
         <w:t xml:space="preserve">Na účtu Google musíte mít zapnuté dvoufázové ověření: </w:t>
       </w:r>
-      <w:hyperlink w:history="1" r:id="rIdphdohgzqv6bdeb4t23022">
+      <w:hyperlink w:history="1" r:id="rIdfsnc6kjh3u78dqftgogin">
         <w:r>
           <w:rPr>
             <w:rStyle w:val="Hyperlink"/>
@@ -357,7 +421,7 @@
       <w:r>
         <w:t xml:space="preserve">Otevřete stránku pro vytvoření hesla aplikace: </w:t>
       </w:r>
-      <w:hyperlink w:history="1" r:id="rIdls3ijeks50nftoup1svym">
+      <w:hyperlink w:history="1" r:id="rIdd_svuni48sibfgezudekh">
         <w:r>
           <w:rPr>
             <w:rStyle w:val="Hyperlink"/>
@@ -400,7 +464,7 @@
       <w:r>
         <w:t xml:space="preserve">Návod Googlu: </w:t>
       </w:r>
-      <w:hyperlink w:history="1" r:id="rIduxiuu6jjxgxe309temehs">
+      <w:hyperlink w:history="1" r:id="rIds_cu6smv4gipfpqs-ecuc">
         <w:r>
           <w:rPr>
             <w:rStyle w:val="Hyperlink"/>
@@ -2281,6 +2345,18 @@
       </w:pPr>
       <w:r>
         <w:t xml:space="preserve">Nerozpoznává se text z obrázků: doinstalujte český jazykový balíček pro rozpoznávání textu.</w:t>
+      </w:r>
+    </w:p>
+    <w:p>
+      <w:pPr>
+        <w:pStyle w:val="ListParagraph"/>
+        <w:numPr>
+          <w:ilvl w:val="0"/>
+          <w:numId w:val="2"/>
+        </w:numPr>
+      </w:pPr>
+      <w:r>
+        <w:t xml:space="preserve">Po otevření zprávy čte JAWS nebo NVDA název okna nebo editační pole: restartujte odečítač, aby načetl skript nebo doplněk Pošty. Pokud to nepomůže, spusťte instalaci znovu.</w:t>
       </w:r>
     </w:p>
     <w:p>

</xml_diff>